<commit_message>
opentf2 at sigir2026 resource track
</commit_message>
<xml_diff>
--- a/res/hfani_cv_full.docx
+++ b/res/hfani_cv_full.docx
@@ -12177,9 +12177,62 @@
                 <w:color w:val="000000" w:themeColor="text1"/>
                 <w:sz w:val="20"/>
                 <w:szCs w:val="20"/>
-                <w:lang w:val="en-US"/>
-              </w:rPr>
-              <w:t xml:space="preserve">, Saeedi, Rueda, Paul, </w:t>
+                <w:vertAlign w:val="superscript"/>
+                <w:lang w:val="en-US"/>
+              </w:rPr>
+              <w:t>*</w:t>
+            </w:r>
+            <w:r>
+              <w:rPr>
+                <w:rFonts w:ascii="Garamond" w:hAnsi="Garamond" w:cstheme="minorHAnsi"/>
+                <w:color w:val="000000" w:themeColor="text1"/>
+                <w:sz w:val="20"/>
+                <w:szCs w:val="20"/>
+                <w:lang w:val="en-US"/>
+              </w:rPr>
+              <w:t>, Saeedi, Rueda</w:t>
+            </w:r>
+            <w:r>
+              <w:rPr>
+                <w:rFonts w:ascii="Garamond" w:hAnsi="Garamond" w:cstheme="minorHAnsi"/>
+                <w:color w:val="000000" w:themeColor="text1"/>
+                <w:sz w:val="20"/>
+                <w:szCs w:val="20"/>
+                <w:vertAlign w:val="superscript"/>
+                <w:lang w:val="en-US"/>
+              </w:rPr>
+              <w:t>†</w:t>
+            </w:r>
+            <w:r>
+              <w:rPr>
+                <w:rFonts w:ascii="Garamond" w:hAnsi="Garamond" w:cstheme="minorHAnsi"/>
+                <w:color w:val="000000" w:themeColor="text1"/>
+                <w:sz w:val="20"/>
+                <w:szCs w:val="20"/>
+                <w:lang w:val="en-US"/>
+              </w:rPr>
+              <w:t>, Paul</w:t>
+            </w:r>
+            <w:r>
+              <w:rPr>
+                <w:rFonts w:ascii="Garamond" w:hAnsi="Garamond" w:cstheme="minorHAnsi"/>
+                <w:color w:val="000000" w:themeColor="text1"/>
+                <w:sz w:val="20"/>
+                <w:szCs w:val="20"/>
+                <w:vertAlign w:val="superscript"/>
+                <w:lang w:val="en-US"/>
+              </w:rPr>
+              <w:t>†</w:t>
+            </w:r>
+            <w:r>
+              <w:rPr>
+                <w:rFonts w:ascii="Garamond" w:hAnsi="Garamond" w:cstheme="minorHAnsi"/>
+                <w:color w:val="000000" w:themeColor="text1"/>
+                <w:sz w:val="20"/>
+                <w:szCs w:val="20"/>
+                <w:lang w:val="en-US"/>
+              </w:rPr>
+              <w:t xml:space="preserve">, </w:t>
             </w:r>
             <w:r>
               <w:rPr>
@@ -14901,7 +14954,17 @@
                 <w:szCs w:val="20"/>
                 <w:lang w:val="en-US"/>
               </w:rPr>
-              <w:t xml:space="preserve">39. Saeedi, </w:t>
+              <w:t>40</w:t>
+            </w:r>
+            <w:r>
+              <w:rPr>
+                <w:rFonts w:ascii="Garamond" w:hAnsi="Garamond" w:cstheme="minorHAnsi"/>
+                <w:color w:val="000000" w:themeColor="text1"/>
+                <w:sz w:val="20"/>
+                <w:szCs w:val="20"/>
+                <w:lang w:val="en-US"/>
+              </w:rPr>
+              <w:t xml:space="preserve">. </w:t>
             </w:r>
             <w:proofErr w:type="spellStart"/>
             <w:r>
@@ -14912,9 +14975,103 @@
                 <w:szCs w:val="20"/>
                 <w:lang w:val="en-US"/>
               </w:rPr>
-              <w:t>Kobti</w:t>
+              <w:t>Loghmani</w:t>
             </w:r>
             <w:proofErr w:type="spellEnd"/>
+            <w:r>
+              <w:rPr>
+                <w:rFonts w:ascii="Garamond" w:hAnsi="Garamond" w:cstheme="minorHAnsi"/>
+                <w:color w:val="000000" w:themeColor="text1"/>
+                <w:sz w:val="20"/>
+                <w:szCs w:val="20"/>
+                <w:vertAlign w:val="superscript"/>
+                <w:lang w:val="en-US"/>
+              </w:rPr>
+              <w:t>*</w:t>
+            </w:r>
+            <w:r>
+              <w:rPr>
+                <w:rFonts w:ascii="Garamond" w:hAnsi="Garamond" w:cstheme="minorHAnsi"/>
+                <w:color w:val="000000" w:themeColor="text1"/>
+                <w:sz w:val="20"/>
+                <w:szCs w:val="20"/>
+                <w:lang w:val="en-US"/>
+              </w:rPr>
+              <w:t>, Ahmed</w:t>
+            </w:r>
+            <w:r>
+              <w:rPr>
+                <w:rFonts w:ascii="Garamond" w:hAnsi="Garamond" w:cstheme="minorHAnsi"/>
+                <w:color w:val="000000" w:themeColor="text1"/>
+                <w:sz w:val="20"/>
+                <w:szCs w:val="20"/>
+                <w:vertAlign w:val="superscript"/>
+                <w:lang w:val="en-US"/>
+              </w:rPr>
+              <w:t>*</w:t>
+            </w:r>
+            <w:r>
+              <w:rPr>
+                <w:rFonts w:ascii="Garamond" w:hAnsi="Garamond" w:cstheme="minorHAnsi"/>
+                <w:color w:val="000000" w:themeColor="text1"/>
+                <w:sz w:val="20"/>
+                <w:szCs w:val="20"/>
+                <w:lang w:val="en-US"/>
+              </w:rPr>
+              <w:t xml:space="preserve">, </w:t>
+            </w:r>
+            <w:r>
+              <w:rPr>
+                <w:rFonts w:ascii="Garamond" w:hAnsi="Garamond" w:cstheme="minorHAnsi"/>
+                <w:color w:val="000000" w:themeColor="text1"/>
+                <w:sz w:val="20"/>
+                <w:szCs w:val="20"/>
+                <w:lang w:val="en-US"/>
+              </w:rPr>
+              <w:t>Thang</w:t>
+            </w:r>
+            <w:r>
+              <w:rPr>
+                <w:rFonts w:ascii="Garamond" w:hAnsi="Garamond" w:cstheme="minorHAnsi"/>
+                <w:color w:val="000000" w:themeColor="text1"/>
+                <w:sz w:val="20"/>
+                <w:szCs w:val="20"/>
+                <w:vertAlign w:val="superscript"/>
+                <w:lang w:val="en-US"/>
+              </w:rPr>
+              <w:t>*</w:t>
+            </w:r>
+            <w:r>
+              <w:rPr>
+                <w:rFonts w:ascii="Garamond" w:hAnsi="Garamond" w:cstheme="minorHAnsi"/>
+                <w:color w:val="000000" w:themeColor="text1"/>
+                <w:sz w:val="20"/>
+                <w:szCs w:val="20"/>
+                <w:lang w:val="en-US"/>
+              </w:rPr>
+              <w:t xml:space="preserve">, </w:t>
+            </w:r>
+            <w:r>
+              <w:rPr>
+                <w:rFonts w:ascii="Garamond" w:hAnsi="Garamond" w:cstheme="minorHAnsi"/>
+                <w:color w:val="000000" w:themeColor="text1"/>
+                <w:sz w:val="20"/>
+                <w:szCs w:val="20"/>
+                <w:lang w:val="en-US"/>
+              </w:rPr>
+              <w:t>Rueda</w:t>
+            </w:r>
+            <w:r>
+              <w:rPr>
+                <w:rFonts w:ascii="Garamond" w:hAnsi="Garamond" w:cstheme="minorHAnsi"/>
+                <w:color w:val="000000" w:themeColor="text1"/>
+                <w:sz w:val="20"/>
+                <w:szCs w:val="20"/>
+                <w:vertAlign w:val="superscript"/>
+                <w:lang w:val="en-US"/>
+              </w:rPr>
+              <w:t>†</w:t>
+            </w:r>
             <w:r>
               <w:rPr>
                 <w:rFonts w:ascii="Garamond" w:hAnsi="Garamond" w:cstheme="minorHAnsi"/>
@@ -14935,27 +15092,49 @@
                 <w:szCs w:val="20"/>
                 <w:lang w:val="en-US"/>
               </w:rPr>
-              <w:t>Fani</w:t>
-            </w:r>
-            <w:r>
-              <w:rPr>
-                <w:rFonts w:ascii="Garamond" w:hAnsi="Garamond" w:cstheme="minorHAnsi"/>
-                <w:color w:val="000000" w:themeColor="text1"/>
-                <w:sz w:val="20"/>
-                <w:szCs w:val="20"/>
-                <w:lang w:val="en-US"/>
-              </w:rPr>
-              <w:t xml:space="preserve">; </w:t>
-            </w:r>
-            <w:r>
-              <w:rPr>
-                <w:rFonts w:ascii="Garamond" w:hAnsi="Garamond" w:cstheme="minorHAnsi"/>
-                <w:color w:val="000000" w:themeColor="text1"/>
-                <w:sz w:val="20"/>
-                <w:szCs w:val="20"/>
-                <w:lang w:val="en-US"/>
-              </w:rPr>
-              <w:t xml:space="preserve">Learning Collaborative Teams via Social Information Retrieval. </w:t>
+              <w:t>Fa</w:t>
+            </w:r>
+            <w:r>
+              <w:rPr>
+                <w:rFonts w:ascii="Garamond" w:hAnsi="Garamond" w:cstheme="minorHAnsi"/>
+                <w:b/>
+                <w:bCs/>
+                <w:color w:val="000000" w:themeColor="text1"/>
+                <w:sz w:val="20"/>
+                <w:szCs w:val="20"/>
+                <w:lang w:val="en-US"/>
+              </w:rPr>
+              <w:t>ni</w:t>
+            </w:r>
+            <w:r>
+              <w:rPr>
+                <w:rFonts w:ascii="Garamond" w:hAnsi="Garamond" w:cstheme="minorHAnsi"/>
+                <w:color w:val="000000" w:themeColor="text1"/>
+                <w:sz w:val="20"/>
+                <w:szCs w:val="20"/>
+                <w:lang w:val="en-US"/>
+              </w:rPr>
+              <w:t>;</w:t>
+            </w:r>
+            <w:r>
+              <w:rPr>
+                <w:rFonts w:ascii="Garamond" w:hAnsi="Garamond" w:cstheme="minorHAnsi"/>
+                <w:color w:val="000000" w:themeColor="text1"/>
+                <w:sz w:val="20"/>
+                <w:szCs w:val="20"/>
+                <w:lang w:val="en-US"/>
+              </w:rPr>
+              <w:t xml:space="preserve"> OpeNTF2: Fairness-aware Graph Neural Team Formation</w:t>
+            </w:r>
+            <w:r>
+              <w:rPr>
+                <w:rFonts w:ascii="Garamond" w:hAnsi="Garamond" w:cstheme="minorHAnsi"/>
+                <w:color w:val="000000" w:themeColor="text1"/>
+                <w:sz w:val="20"/>
+                <w:szCs w:val="20"/>
+                <w:lang w:val="en-US"/>
+              </w:rPr>
+              <w:t xml:space="preserve">. </w:t>
             </w:r>
             <w:r>
               <w:rPr>
@@ -14967,17 +15146,41 @@
                 <w:szCs w:val="20"/>
                 <w:lang w:val="en-US"/>
               </w:rPr>
-              <w:t>In the 2026 ACM Web Conference</w:t>
-            </w:r>
-            <w:r>
-              <w:rPr>
-                <w:rFonts w:ascii="Garamond" w:hAnsi="Garamond" w:cstheme="minorHAnsi"/>
-                <w:color w:val="000000" w:themeColor="text1"/>
-                <w:sz w:val="20"/>
-                <w:szCs w:val="20"/>
-                <w:lang w:val="en-US"/>
-              </w:rPr>
-              <w:t xml:space="preserve"> (</w:t>
+              <w:t>In the 4</w:t>
+            </w:r>
+            <w:r>
+              <w:rPr>
+                <w:rFonts w:ascii="Garamond" w:hAnsi="Garamond" w:cstheme="minorHAnsi"/>
+                <w:i/>
+                <w:iCs/>
+                <w:color w:val="000000" w:themeColor="text1"/>
+                <w:sz w:val="20"/>
+                <w:szCs w:val="20"/>
+                <w:lang w:val="en-US"/>
+              </w:rPr>
+              <w:t>9</w:t>
+            </w:r>
+            <w:r>
+              <w:rPr>
+                <w:rFonts w:ascii="Garamond" w:hAnsi="Garamond" w:cstheme="minorHAnsi"/>
+                <w:i/>
+                <w:iCs/>
+                <w:color w:val="000000" w:themeColor="text1"/>
+                <w:sz w:val="20"/>
+                <w:szCs w:val="20"/>
+                <w:lang w:val="en-US"/>
+              </w:rPr>
+              <w:t xml:space="preserve">th International ACM SIGIR Conference on Research and Development in Information Retrieval </w:t>
+            </w:r>
+            <w:r>
+              <w:rPr>
+                <w:rFonts w:ascii="Garamond" w:hAnsi="Garamond" w:cstheme="minorHAnsi"/>
+                <w:color w:val="000000" w:themeColor="text1"/>
+                <w:sz w:val="20"/>
+                <w:szCs w:val="20"/>
+                <w:lang w:val="en-US"/>
+              </w:rPr>
+              <w:t>(</w:t>
             </w:r>
             <w:r>
               <w:rPr>
@@ -14989,7 +15192,7 @@
                 <w:szCs w:val="20"/>
                 <w:lang w:val="en-US"/>
               </w:rPr>
-              <w:t>WWW</w:t>
+              <w:t>SIGIR</w:t>
             </w:r>
             <w:r>
               <w:rPr>
@@ -15000,16 +15203,6 @@
                 <w:lang w:val="en-US"/>
               </w:rPr>
               <w:t>)</w:t>
-            </w:r>
-            <w:r>
-              <w:rPr>
-                <w:rFonts w:ascii="Garamond" w:hAnsi="Garamond" w:cstheme="minorHAnsi"/>
-                <w:color w:val="000000" w:themeColor="text1"/>
-                <w:sz w:val="20"/>
-                <w:szCs w:val="20"/>
-                <w:lang w:val="en-US"/>
-              </w:rPr>
-              <w:t xml:space="preserve">, </w:t>
             </w:r>
             <w:r>
               <w:rPr>
@@ -15021,17 +15214,55 @@
                 <w:szCs w:val="20"/>
                 <w:lang w:val="en-US"/>
               </w:rPr>
-              <w:t>UAE, Dubai, CORE Rank: A*</w:t>
-            </w:r>
-            <w:r>
-              <w:rPr>
-                <w:rFonts w:ascii="Garamond" w:hAnsi="Garamond" w:cstheme="minorHAnsi"/>
-                <w:color w:val="000000" w:themeColor="text1"/>
-                <w:sz w:val="20"/>
-                <w:szCs w:val="20"/>
-                <w:lang w:val="en-US"/>
-              </w:rPr>
-              <w:t>.</w:t>
+              <w:t xml:space="preserve">, </w:t>
+            </w:r>
+            <w:r>
+              <w:rPr>
+                <w:rFonts w:ascii="Garamond" w:hAnsi="Garamond" w:cstheme="minorHAnsi"/>
+                <w:i/>
+                <w:iCs/>
+                <w:color w:val="000000" w:themeColor="text1"/>
+                <w:sz w:val="20"/>
+                <w:szCs w:val="20"/>
+                <w:lang w:val="en-US"/>
+              </w:rPr>
+              <w:t>Melbourne</w:t>
+            </w:r>
+            <w:r>
+              <w:rPr>
+                <w:rFonts w:ascii="Garamond" w:hAnsi="Garamond" w:cstheme="minorHAnsi"/>
+                <w:i/>
+                <w:iCs/>
+                <w:color w:val="000000" w:themeColor="text1"/>
+                <w:sz w:val="20"/>
+                <w:szCs w:val="20"/>
+                <w:lang w:val="en-US"/>
+              </w:rPr>
+              <w:t xml:space="preserve">, </w:t>
+            </w:r>
+            <w:r>
+              <w:rPr>
+                <w:rFonts w:ascii="Garamond" w:hAnsi="Garamond" w:cstheme="minorHAnsi"/>
+                <w:i/>
+                <w:iCs/>
+                <w:color w:val="000000" w:themeColor="text1"/>
+                <w:sz w:val="20"/>
+                <w:szCs w:val="20"/>
+                <w:lang w:val="en-US"/>
+              </w:rPr>
+              <w:t>Australia</w:t>
+            </w:r>
+            <w:r>
+              <w:rPr>
+                <w:rFonts w:ascii="Garamond" w:hAnsi="Garamond" w:cstheme="minorHAnsi"/>
+                <w:i/>
+                <w:iCs/>
+                <w:color w:val="000000" w:themeColor="text1"/>
+                <w:sz w:val="20"/>
+                <w:szCs w:val="20"/>
+                <w:lang w:val="en-US"/>
+              </w:rPr>
+              <w:t xml:space="preserve">, CORE Rank: A* </w:t>
             </w:r>
           </w:p>
         </w:tc>
@@ -15059,7 +15290,17 @@
                 <w:szCs w:val="20"/>
                 <w:lang w:val="en-US"/>
               </w:rPr>
-              <w:t>2026</w:t>
+              <w:t>202</w:t>
+            </w:r>
+            <w:r>
+              <w:rPr>
+                <w:rFonts w:ascii="Garamond" w:hAnsi="Garamond" w:cstheme="minorHAnsi"/>
+                <w:color w:val="000000" w:themeColor="text1"/>
+                <w:sz w:val="20"/>
+                <w:szCs w:val="20"/>
+                <w:lang w:val="en-US"/>
+              </w:rPr>
+              <w:t>6</w:t>
             </w:r>
           </w:p>
         </w:tc>
@@ -15092,17 +15333,29 @@
                 <w:szCs w:val="20"/>
                 <w:lang w:val="en-US"/>
               </w:rPr>
-              <w:t xml:space="preserve">38. </w:t>
-            </w:r>
-            <w:r>
-              <w:rPr>
-                <w:rFonts w:ascii="Garamond" w:hAnsi="Garamond" w:cstheme="minorHAnsi"/>
-                <w:color w:val="000000" w:themeColor="text1"/>
-                <w:sz w:val="20"/>
-                <w:szCs w:val="20"/>
-                <w:lang w:val="en-US"/>
-              </w:rPr>
-              <w:t xml:space="preserve">Saeedi, </w:t>
+              <w:t xml:space="preserve">39. Saeedi, </w:t>
+            </w:r>
+            <w:proofErr w:type="spellStart"/>
+            <w:r>
+              <w:rPr>
+                <w:rFonts w:ascii="Garamond" w:hAnsi="Garamond" w:cstheme="minorHAnsi"/>
+                <w:color w:val="000000" w:themeColor="text1"/>
+                <w:sz w:val="20"/>
+                <w:szCs w:val="20"/>
+                <w:lang w:val="en-US"/>
+              </w:rPr>
+              <w:t>Kobti</w:t>
+            </w:r>
+            <w:proofErr w:type="spellEnd"/>
+            <w:r>
+              <w:rPr>
+                <w:rFonts w:ascii="Garamond" w:hAnsi="Garamond" w:cstheme="minorHAnsi"/>
+                <w:color w:val="000000" w:themeColor="text1"/>
+                <w:sz w:val="20"/>
+                <w:szCs w:val="20"/>
+                <w:lang w:val="en-US"/>
+              </w:rPr>
+              <w:t xml:space="preserve">, </w:t>
             </w:r>
             <w:r>
               <w:rPr>
@@ -15124,7 +15377,17 @@
                 <w:szCs w:val="20"/>
                 <w:lang w:val="en-US"/>
               </w:rPr>
-              <w:t xml:space="preserve">; Neural Shifts in Collaborative Team Recommendation. </w:t>
+              <w:t xml:space="preserve">; </w:t>
+            </w:r>
+            <w:r>
+              <w:rPr>
+                <w:rFonts w:ascii="Garamond" w:hAnsi="Garamond" w:cstheme="minorHAnsi"/>
+                <w:color w:val="000000" w:themeColor="text1"/>
+                <w:sz w:val="20"/>
+                <w:szCs w:val="20"/>
+                <w:lang w:val="en-US"/>
+              </w:rPr>
+              <w:t xml:space="preserve">Learning Collaborative Teams via Social Information Retrieval. </w:t>
             </w:r>
             <w:r>
               <w:rPr>
@@ -15136,7 +15399,7 @@
                 <w:szCs w:val="20"/>
                 <w:lang w:val="en-US"/>
               </w:rPr>
-              <w:t>In the 34th ACM International Conference on Information and Knowledge Management</w:t>
+              <w:t>In the 2026 ACM Web Conference</w:t>
             </w:r>
             <w:r>
               <w:rPr>
@@ -15158,17 +15421,27 @@
                 <w:szCs w:val="20"/>
                 <w:lang w:val="en-US"/>
               </w:rPr>
-              <w:t>CIKM</w:t>
-            </w:r>
-            <w:r>
-              <w:rPr>
-                <w:rFonts w:ascii="Garamond" w:hAnsi="Garamond" w:cstheme="minorHAnsi"/>
-                <w:color w:val="000000" w:themeColor="text1"/>
-                <w:sz w:val="20"/>
-                <w:szCs w:val="20"/>
-                <w:lang w:val="en-US"/>
-              </w:rPr>
-              <w:t xml:space="preserve">), </w:t>
+              <w:t>WWW</w:t>
+            </w:r>
+            <w:r>
+              <w:rPr>
+                <w:rFonts w:ascii="Garamond" w:hAnsi="Garamond" w:cstheme="minorHAnsi"/>
+                <w:color w:val="000000" w:themeColor="text1"/>
+                <w:sz w:val="20"/>
+                <w:szCs w:val="20"/>
+                <w:lang w:val="en-US"/>
+              </w:rPr>
+              <w:t>)</w:t>
+            </w:r>
+            <w:r>
+              <w:rPr>
+                <w:rFonts w:ascii="Garamond" w:hAnsi="Garamond" w:cstheme="minorHAnsi"/>
+                <w:color w:val="000000" w:themeColor="text1"/>
+                <w:sz w:val="20"/>
+                <w:szCs w:val="20"/>
+                <w:lang w:val="en-US"/>
+              </w:rPr>
+              <w:t xml:space="preserve">, </w:t>
             </w:r>
             <w:r>
               <w:rPr>
@@ -15180,25 +15453,11 @@
                 <w:szCs w:val="20"/>
                 <w:lang w:val="en-US"/>
               </w:rPr>
-              <w:t xml:space="preserve">Seol, South Korea, </w:t>
-            </w:r>
-            <w:r>
-              <w:rPr>
-                <w:rFonts w:ascii="Garamond" w:hAnsi="Garamond" w:cstheme="minorHAnsi"/>
-                <w:i/>
-                <w:iCs/>
-                <w:color w:val="000000" w:themeColor="text1"/>
-                <w:sz w:val="20"/>
-                <w:szCs w:val="20"/>
-                <w:lang w:val="en-US"/>
-              </w:rPr>
-              <w:t>CORE Rank: A</w:t>
-            </w:r>
-            <w:r>
-              <w:rPr>
-                <w:rFonts w:ascii="Garamond" w:hAnsi="Garamond" w:cstheme="minorHAnsi"/>
-                <w:i/>
-                <w:iCs/>
+              <w:t>UAE, Dubai, CORE Rank: A*</w:t>
+            </w:r>
+            <w:r>
+              <w:rPr>
+                <w:rFonts w:ascii="Garamond" w:hAnsi="Garamond" w:cstheme="minorHAnsi"/>
                 <w:color w:val="000000" w:themeColor="text1"/>
                 <w:sz w:val="20"/>
                 <w:szCs w:val="20"/>
@@ -15232,7 +15491,7 @@
                 <w:szCs w:val="20"/>
                 <w:lang w:val="en-US"/>
               </w:rPr>
-              <w:t>2025</w:t>
+              <w:t>2026</w:t>
             </w:r>
           </w:p>
         </w:tc>
@@ -15265,7 +15524,201 @@
                 <w:szCs w:val="20"/>
                 <w:lang w:val="en-US"/>
               </w:rPr>
-              <w:t xml:space="preserve">37. Thang, Hosseini, </w:t>
+              <w:t xml:space="preserve">38. </w:t>
+            </w:r>
+            <w:r>
+              <w:rPr>
+                <w:rFonts w:ascii="Garamond" w:hAnsi="Garamond" w:cstheme="minorHAnsi"/>
+                <w:color w:val="000000" w:themeColor="text1"/>
+                <w:sz w:val="20"/>
+                <w:szCs w:val="20"/>
+                <w:lang w:val="en-US"/>
+              </w:rPr>
+              <w:t xml:space="preserve">Saeedi, </w:t>
+            </w:r>
+            <w:r>
+              <w:rPr>
+                <w:rFonts w:ascii="Garamond" w:hAnsi="Garamond" w:cstheme="minorHAnsi"/>
+                <w:b/>
+                <w:bCs/>
+                <w:color w:val="000000" w:themeColor="text1"/>
+                <w:sz w:val="20"/>
+                <w:szCs w:val="20"/>
+                <w:lang w:val="en-US"/>
+              </w:rPr>
+              <w:t>Fani</w:t>
+            </w:r>
+            <w:r>
+              <w:rPr>
+                <w:rFonts w:ascii="Garamond" w:hAnsi="Garamond" w:cstheme="minorHAnsi"/>
+                <w:color w:val="000000" w:themeColor="text1"/>
+                <w:sz w:val="20"/>
+                <w:szCs w:val="20"/>
+                <w:lang w:val="en-US"/>
+              </w:rPr>
+              <w:t xml:space="preserve">; Neural Shifts in Collaborative Team Recommendation. </w:t>
+            </w:r>
+            <w:r>
+              <w:rPr>
+                <w:rFonts w:ascii="Garamond" w:hAnsi="Garamond" w:cstheme="minorHAnsi"/>
+                <w:i/>
+                <w:iCs/>
+                <w:color w:val="000000" w:themeColor="text1"/>
+                <w:sz w:val="20"/>
+                <w:szCs w:val="20"/>
+                <w:lang w:val="en-US"/>
+              </w:rPr>
+              <w:t>In the 34th ACM International Conference on Information and Knowledge Management</w:t>
+            </w:r>
+            <w:r>
+              <w:rPr>
+                <w:rFonts w:ascii="Garamond" w:hAnsi="Garamond" w:cstheme="minorHAnsi"/>
+                <w:color w:val="000000" w:themeColor="text1"/>
+                <w:sz w:val="20"/>
+                <w:szCs w:val="20"/>
+                <w:lang w:val="en-US"/>
+              </w:rPr>
+              <w:t xml:space="preserve"> (</w:t>
+            </w:r>
+            <w:r>
+              <w:rPr>
+                <w:rFonts w:ascii="Garamond" w:hAnsi="Garamond" w:cstheme="minorHAnsi"/>
+                <w:b/>
+                <w:bCs/>
+                <w:color w:val="000000" w:themeColor="text1"/>
+                <w:sz w:val="20"/>
+                <w:szCs w:val="20"/>
+                <w:lang w:val="en-US"/>
+              </w:rPr>
+              <w:t>CIKM</w:t>
+            </w:r>
+            <w:r>
+              <w:rPr>
+                <w:rFonts w:ascii="Garamond" w:hAnsi="Garamond" w:cstheme="minorHAnsi"/>
+                <w:color w:val="000000" w:themeColor="text1"/>
+                <w:sz w:val="20"/>
+                <w:szCs w:val="20"/>
+                <w:lang w:val="en-US"/>
+              </w:rPr>
+              <w:t xml:space="preserve">), </w:t>
+            </w:r>
+            <w:r>
+              <w:rPr>
+                <w:rFonts w:ascii="Garamond" w:hAnsi="Garamond" w:cstheme="minorHAnsi"/>
+                <w:i/>
+                <w:iCs/>
+                <w:color w:val="000000" w:themeColor="text1"/>
+                <w:sz w:val="20"/>
+                <w:szCs w:val="20"/>
+                <w:lang w:val="en-US"/>
+              </w:rPr>
+              <w:t xml:space="preserve">Seol, South Korea, </w:t>
+            </w:r>
+            <w:r>
+              <w:rPr>
+                <w:rFonts w:ascii="Garamond" w:hAnsi="Garamond" w:cstheme="minorHAnsi"/>
+                <w:i/>
+                <w:iCs/>
+                <w:color w:val="000000" w:themeColor="text1"/>
+                <w:sz w:val="20"/>
+                <w:szCs w:val="20"/>
+                <w:lang w:val="en-US"/>
+              </w:rPr>
+              <w:t>CORE Rank: A</w:t>
+            </w:r>
+            <w:r>
+              <w:rPr>
+                <w:rFonts w:ascii="Garamond" w:hAnsi="Garamond" w:cstheme="minorHAnsi"/>
+                <w:i/>
+                <w:iCs/>
+                <w:color w:val="000000" w:themeColor="text1"/>
+                <w:sz w:val="20"/>
+                <w:szCs w:val="20"/>
+                <w:lang w:val="en-US"/>
+              </w:rPr>
+              <w:t>.</w:t>
+            </w:r>
+          </w:p>
+        </w:tc>
+        <w:tc>
+          <w:tcPr>
+            <w:tcW w:w="673" w:type="dxa"/>
+          </w:tcPr>
+          <w:p>
+            <w:pPr>
+              <w:spacing w:after="120"/>
+              <w:jc w:val="right"/>
+              <w:rPr>
+                <w:rFonts w:ascii="Garamond" w:hAnsi="Garamond" w:cstheme="minorHAnsi"/>
+                <w:color w:val="000000" w:themeColor="text1"/>
+                <w:sz w:val="20"/>
+                <w:szCs w:val="20"/>
+                <w:lang w:val="en-US"/>
+              </w:rPr>
+            </w:pPr>
+            <w:r>
+              <w:rPr>
+                <w:rFonts w:ascii="Garamond" w:hAnsi="Garamond" w:cstheme="minorHAnsi"/>
+                <w:color w:val="000000" w:themeColor="text1"/>
+                <w:sz w:val="20"/>
+                <w:szCs w:val="20"/>
+                <w:lang w:val="en-US"/>
+              </w:rPr>
+              <w:t>2025</w:t>
+            </w:r>
+          </w:p>
+        </w:tc>
+      </w:tr>
+      <w:tr>
+        <w:trPr>
+          <w:trHeight w:val="263"/>
+        </w:trPr>
+        <w:tc>
+          <w:tcPr>
+            <w:tcW w:w="10302" w:type="dxa"/>
+          </w:tcPr>
+          <w:p>
+            <w:pPr>
+              <w:spacing w:after="120"/>
+              <w:jc w:val="both"/>
+              <w:rPr>
+                <w:rFonts w:ascii="Garamond" w:hAnsi="Garamond" w:cstheme="minorHAnsi"/>
+                <w:color w:val="000000" w:themeColor="text1"/>
+                <w:sz w:val="20"/>
+                <w:szCs w:val="20"/>
+                <w:lang w:val="en-US"/>
+              </w:rPr>
+            </w:pPr>
+            <w:r>
+              <w:rPr>
+                <w:rFonts w:ascii="Garamond" w:hAnsi="Garamond" w:cstheme="minorHAnsi"/>
+                <w:color w:val="000000" w:themeColor="text1"/>
+                <w:sz w:val="20"/>
+                <w:szCs w:val="20"/>
+                <w:lang w:val="en-US"/>
+              </w:rPr>
+              <w:t>37. Thang</w:t>
+            </w:r>
+            <w:r>
+              <w:rPr>
+                <w:rFonts w:ascii="Garamond" w:hAnsi="Garamond" w:cstheme="minorHAnsi"/>
+                <w:color w:val="000000" w:themeColor="text1"/>
+                <w:sz w:val="20"/>
+                <w:szCs w:val="20"/>
+                <w:vertAlign w:val="superscript"/>
+                <w:lang w:val="en-US"/>
+              </w:rPr>
+              <w:t>*</w:t>
+            </w:r>
+            <w:r>
+              <w:rPr>
+                <w:rFonts w:ascii="Garamond" w:hAnsi="Garamond" w:cstheme="minorHAnsi"/>
+                <w:color w:val="000000" w:themeColor="text1"/>
+                <w:sz w:val="20"/>
+                <w:szCs w:val="20"/>
+                <w:lang w:val="en-US"/>
+              </w:rPr>
+              <w:t xml:space="preserve">, Hosseini, </w:t>
             </w:r>
             <w:r>
               <w:rPr>
@@ -19804,6 +20257,7 @@
                 <w:szCs w:val="20"/>
                 <w:lang w:val="en-US"/>
               </w:rPr>
+              <w:lastRenderedPageBreak/>
               <w:t>19. Dashti</w:t>
             </w:r>
             <w:r>
@@ -20242,7 +20696,6 @@
                 <w:szCs w:val="20"/>
                 <w:lang w:val="en-US"/>
               </w:rPr>
-              <w:lastRenderedPageBreak/>
               <w:t xml:space="preserve">18. </w:t>
             </w:r>
             <w:proofErr w:type="spellStart"/>
@@ -26194,6 +26647,7 @@
                 <w:szCs w:val="20"/>
                 <w:lang w:val="en-US"/>
               </w:rPr>
+              <w:lastRenderedPageBreak/>
               <w:t xml:space="preserve">03. </w:t>
             </w:r>
             <w:proofErr w:type="spellStart"/>
@@ -26366,7 +26820,6 @@
                 <w:szCs w:val="20"/>
                 <w:lang w:val="en-US"/>
               </w:rPr>
-              <w:lastRenderedPageBreak/>
               <w:t xml:space="preserve">02. </w:t>
             </w:r>
             <w:proofErr w:type="spellStart"/>
@@ -32746,6 +33199,7 @@
                 <w:szCs w:val="20"/>
                 <w:lang w:val="en-US"/>
               </w:rPr>
+              <w:lastRenderedPageBreak/>
               <w:t xml:space="preserve">09. Gabriel Rueda, BSc, </w:t>
             </w:r>
             <w:r>
@@ -33089,7 +33543,6 @@
                 <w:szCs w:val="20"/>
                 <w:lang w:val="en-US"/>
               </w:rPr>
-              <w:lastRenderedPageBreak/>
               <w:t xml:space="preserve">06. </w:t>
             </w:r>
             <w:proofErr w:type="spellStart"/>
@@ -40373,6 +40826,7 @@
                 <w:szCs w:val="20"/>
                 <w:lang w:val="en-US"/>
               </w:rPr>
+              <w:lastRenderedPageBreak/>
               <w:t xml:space="preserve">15. </w:t>
             </w:r>
             <w:r>
@@ -40787,7 +41241,6 @@
                 <w:szCs w:val="20"/>
                 <w:lang w:val="en-US"/>
               </w:rPr>
-              <w:lastRenderedPageBreak/>
               <w:t xml:space="preserve">12. </w:t>
             </w:r>
             <w:r>
@@ -46559,6 +47012,7 @@
                 <w:szCs w:val="20"/>
                 <w:lang w:val="en-US"/>
               </w:rPr>
+              <w:lastRenderedPageBreak/>
               <w:t>3</w:t>
             </w:r>
             <w:r>
@@ -46896,7 +47350,6 @@
           <w:szCs w:val="20"/>
           <w:lang w:val="en-US"/>
         </w:rPr>
-        <w:lastRenderedPageBreak/>
         <w:t>P</w:t>
       </w:r>
       <w:r>
@@ -51267,7 +51720,12 @@
 </file>
 
 <file path=customXml/item1.xml><?xml version="1.0" encoding="utf-8"?>
-<b:Sources xmlns:b="http://schemas.openxmlformats.org/officeDocument/2006/bibliography" xmlns="http://schemas.openxmlformats.org/officeDocument/2006/bibliography" SelectedStyle="/APASixthEditionOfficeOnline.xsl" StyleName="APA" Version="6"/>
+<?mso-contentType ?>
+<FormTemplates xmlns="http://schemas.microsoft.com/sharepoint/v3/contenttype/forms">
+  <Display>DocumentLibraryForm</Display>
+  <Edit>DocumentLibraryForm</Edit>
+  <New>DocumentLibraryForm</New>
+</FormTemplates>
 </file>
 
 <file path=customXml/item2.xml><?xml version="1.0" encoding="utf-8"?>
@@ -51468,12 +51926,7 @@
 </file>
 
 <file path=customXml/item3.xml><?xml version="1.0" encoding="utf-8"?>
-<?mso-contentType ?>
-<FormTemplates xmlns="http://schemas.microsoft.com/sharepoint/v3/contenttype/forms">
-  <Display>DocumentLibraryForm</Display>
-  <Edit>DocumentLibraryForm</Edit>
-  <New>DocumentLibraryForm</New>
-</FormTemplates>
+<b:Sources xmlns:b="http://schemas.openxmlformats.org/officeDocument/2006/bibliography" xmlns="http://schemas.openxmlformats.org/officeDocument/2006/bibliography" SelectedStyle="/APASixthEditionOfficeOnline.xsl" StyleName="APA" Version="6"/>
 </file>
 
 <file path=customXml/item4.xml><?xml version="1.0" encoding="utf-8"?>
@@ -51483,9 +51936,9 @@
 </file>
 
 <file path=customXml/itemProps1.xml><?xml version="1.0" encoding="utf-8"?>
-<ds:datastoreItem xmlns:ds="http://schemas.openxmlformats.org/officeDocument/2006/customXml" ds:itemID="{8E80AEE6-875D-B44A-8018-5A824812E991}">
+<ds:datastoreItem xmlns:ds="http://schemas.openxmlformats.org/officeDocument/2006/customXml" ds:itemID="{5A2067E7-F5F7-49D0-ABCF-38AB1AF93D02}">
   <ds:schemaRefs>
-    <ds:schemaRef ds:uri="http://schemas.openxmlformats.org/officeDocument/2006/bibliography"/>
+    <ds:schemaRef ds:uri="http://schemas.microsoft.com/sharepoint/v3/contenttype/forms"/>
   </ds:schemaRefs>
 </ds:datastoreItem>
 </file>
@@ -51510,9 +51963,9 @@
 </file>
 
 <file path=customXml/itemProps3.xml><?xml version="1.0" encoding="utf-8"?>
-<ds:datastoreItem xmlns:ds="http://schemas.openxmlformats.org/officeDocument/2006/customXml" ds:itemID="{5A2067E7-F5F7-49D0-ABCF-38AB1AF93D02}">
+<ds:datastoreItem xmlns:ds="http://schemas.openxmlformats.org/officeDocument/2006/customXml" ds:itemID="{8E80AEE6-875D-B44A-8018-5A824812E991}">
   <ds:schemaRefs>
-    <ds:schemaRef ds:uri="http://schemas.microsoft.com/sharepoint/v3/contenttype/forms"/>
+    <ds:schemaRef ds:uri="http://schemas.openxmlformats.org/officeDocument/2006/bibliography"/>
   </ds:schemaRefs>
 </ds:datastoreItem>
 </file>

</xml_diff>